<commit_message>
Regenerate Solution Design template with Review and Approval block
Co-Authored-By: Claude Opus 4.8 (1M context) <noreply@anthropic.com>
</commit_message>
<xml_diff>
--- a/public/templates/YAT-Solution-Design-Template.docx
+++ b/public/templates/YAT-Solution-Design-Template.docx
@@ -4109,6 +4109,737 @@
         <w:pStyle w:val="Heading1"/>
       </w:pPr>
       <w:r>
+        <w:t>9. Review and Approval</w:t>
+      </w:r>
+    </w:p>
+    <w:p>
+      <w:r>
+        <w:rPr>
+          <w:i/>
+          <w:color w:val="6B6660"/>
+          <w:sz w:val="19"/>
+        </w:rPr>
+        <w:t>The completed design is submitted to the accepting authority / superior for review. The reviewer records their feedback below; the author records how each point was addressed; the reviewer then signs off on the design before it is implemented.</w:t>
+      </w:r>
+    </w:p>
+    <w:p>
+      <w:pPr>
+        <w:pStyle w:val="Heading3"/>
+      </w:pPr>
+      <w:r>
+        <w:t>9.1 Reviewer feedback and author response</w:t>
+      </w:r>
+    </w:p>
+    <w:tbl>
+      <w:tblPr>
+        <w:tblW w:type="auto" w:w="0"/>
+        <w:jc w:val="center"/>
+        <w:tblLayout w:type="autofit"/>
+        <w:tblLook w:firstColumn="1" w:firstRow="1" w:lastColumn="0" w:lastRow="0" w:noHBand="0" w:noVBand="1" w:val="04A0"/>
+      </w:tblPr>
+      <w:tblGrid>
+        <w:gridCol w:w="2353"/>
+        <w:gridCol w:w="2353"/>
+        <w:gridCol w:w="2353"/>
+        <w:gridCol w:w="2353"/>
+      </w:tblGrid>
+      <w:tr>
+        <w:tc>
+          <w:tcPr>
+            <w:tcW w:type="dxa" w:w="454"/>
+            <w:shd w:val="clear" w:color="auto" w:fill="1F5A5C"/>
+            <w:tcBorders>
+              <w:top w:val="single" w:sz="4" w:space="0" w:color="E4DED3"/>
+              <w:left w:val="single" w:sz="4" w:space="0" w:color="E4DED3"/>
+              <w:bottom w:val="single" w:sz="4" w:space="0" w:color="E4DED3"/>
+              <w:right w:val="single" w:sz="4" w:space="0" w:color="E4DED3"/>
+            </w:tcBorders>
+          </w:tcPr>
+          <w:p>
+            <w:r>
+              <w:rPr>
+                <w:b/>
+                <w:color w:val="FFFFFF"/>
+                <w:sz w:val="19"/>
+              </w:rPr>
+              <w:t>#</w:t>
+            </w:r>
+          </w:p>
+        </w:tc>
+        <w:tc>
+          <w:tcPr>
+            <w:tcW w:type="dxa" w:w="3402"/>
+            <w:shd w:val="clear" w:color="auto" w:fill="1F5A5C"/>
+            <w:tcBorders>
+              <w:top w:val="single" w:sz="4" w:space="0" w:color="E4DED3"/>
+              <w:left w:val="single" w:sz="4" w:space="0" w:color="E4DED3"/>
+              <w:bottom w:val="single" w:sz="4" w:space="0" w:color="E4DED3"/>
+              <w:right w:val="single" w:sz="4" w:space="0" w:color="E4DED3"/>
+            </w:tcBorders>
+          </w:tcPr>
+          <w:p>
+            <w:r>
+              <w:rPr>
+                <w:b/>
+                <w:color w:val="FFFFFF"/>
+                <w:sz w:val="19"/>
+              </w:rPr>
+              <w:t>Reviewer feedback / comment</w:t>
+            </w:r>
+          </w:p>
+        </w:tc>
+        <w:tc>
+          <w:tcPr>
+            <w:tcW w:type="dxa" w:w="2948"/>
+            <w:shd w:val="clear" w:color="auto" w:fill="1F5A5C"/>
+            <w:tcBorders>
+              <w:top w:val="single" w:sz="4" w:space="0" w:color="E4DED3"/>
+              <w:left w:val="single" w:sz="4" w:space="0" w:color="E4DED3"/>
+              <w:bottom w:val="single" w:sz="4" w:space="0" w:color="E4DED3"/>
+              <w:right w:val="single" w:sz="4" w:space="0" w:color="E4DED3"/>
+            </w:tcBorders>
+          </w:tcPr>
+          <w:p>
+            <w:r>
+              <w:rPr>
+                <w:b/>
+                <w:color w:val="FFFFFF"/>
+                <w:sz w:val="19"/>
+              </w:rPr>
+              <w:t>Author response</w:t>
+            </w:r>
+          </w:p>
+        </w:tc>
+        <w:tc>
+          <w:tcPr>
+            <w:tcW w:type="dxa" w:w="2268"/>
+            <w:shd w:val="clear" w:color="auto" w:fill="1F5A5C"/>
+            <w:tcBorders>
+              <w:top w:val="single" w:sz="4" w:space="0" w:color="E4DED3"/>
+              <w:left w:val="single" w:sz="4" w:space="0" w:color="E4DED3"/>
+              <w:bottom w:val="single" w:sz="4" w:space="0" w:color="E4DED3"/>
+              <w:right w:val="single" w:sz="4" w:space="0" w:color="E4DED3"/>
+            </w:tcBorders>
+          </w:tcPr>
+          <w:p>
+            <w:r>
+              <w:rPr>
+                <w:b/>
+                <w:color w:val="FFFFFF"/>
+                <w:sz w:val="19"/>
+              </w:rPr>
+              <w:t>Resulting change</w:t>
+            </w:r>
+          </w:p>
+        </w:tc>
+      </w:tr>
+      <w:tr>
+        <w:tc>
+          <w:tcPr>
+            <w:tcW w:type="dxa" w:w="454"/>
+            <w:tcBorders>
+              <w:top w:val="single" w:sz="4" w:space="0" w:color="E4DED3"/>
+              <w:left w:val="single" w:sz="4" w:space="0" w:color="E4DED3"/>
+              <w:bottom w:val="single" w:sz="4" w:space="0" w:color="E4DED3"/>
+              <w:right w:val="single" w:sz="4" w:space="0" w:color="E4DED3"/>
+            </w:tcBorders>
+          </w:tcPr>
+          <w:p>
+            <w:r>
+              <w:rPr>
+                <w:sz w:val="19"/>
+              </w:rPr>
+              <w:t>1</w:t>
+            </w:r>
+          </w:p>
+        </w:tc>
+        <w:tc>
+          <w:tcPr>
+            <w:tcW w:type="dxa" w:w="3402"/>
+            <w:tcBorders>
+              <w:top w:val="single" w:sz="4" w:space="0" w:color="E4DED3"/>
+              <w:left w:val="single" w:sz="4" w:space="0" w:color="E4DED3"/>
+              <w:bottom w:val="single" w:sz="4" w:space="0" w:color="E4DED3"/>
+              <w:right w:val="single" w:sz="4" w:space="0" w:color="E4DED3"/>
+            </w:tcBorders>
+          </w:tcPr>
+          <w:p>
+            <w:r>
+              <w:rPr>
+                <w:i/>
+                <w:color w:val="6B6660"/>
+                <w:sz w:val="19"/>
+              </w:rPr>
+              <w:t>[ … ]</w:t>
+            </w:r>
+          </w:p>
+        </w:tc>
+        <w:tc>
+          <w:tcPr>
+            <w:tcW w:type="dxa" w:w="2948"/>
+            <w:tcBorders>
+              <w:top w:val="single" w:sz="4" w:space="0" w:color="E4DED3"/>
+              <w:left w:val="single" w:sz="4" w:space="0" w:color="E4DED3"/>
+              <w:bottom w:val="single" w:sz="4" w:space="0" w:color="E4DED3"/>
+              <w:right w:val="single" w:sz="4" w:space="0" w:color="E4DED3"/>
+            </w:tcBorders>
+          </w:tcPr>
+          <w:p>
+            <w:r>
+              <w:rPr>
+                <w:i/>
+                <w:color w:val="6B6660"/>
+                <w:sz w:val="19"/>
+              </w:rPr>
+              <w:t>[ … ]</w:t>
+            </w:r>
+          </w:p>
+        </w:tc>
+        <w:tc>
+          <w:tcPr>
+            <w:tcW w:type="dxa" w:w="2268"/>
+            <w:tcBorders>
+              <w:top w:val="single" w:sz="4" w:space="0" w:color="E4DED3"/>
+              <w:left w:val="single" w:sz="4" w:space="0" w:color="E4DED3"/>
+              <w:bottom w:val="single" w:sz="4" w:space="0" w:color="E4DED3"/>
+              <w:right w:val="single" w:sz="4" w:space="0" w:color="E4DED3"/>
+            </w:tcBorders>
+          </w:tcPr>
+          <w:p>
+            <w:r>
+              <w:rPr>
+                <w:i/>
+                <w:color w:val="6B6660"/>
+                <w:sz w:val="19"/>
+              </w:rPr>
+              <w:t>[ … ]</w:t>
+            </w:r>
+          </w:p>
+        </w:tc>
+      </w:tr>
+      <w:tr>
+        <w:tc>
+          <w:tcPr>
+            <w:tcW w:type="dxa" w:w="454"/>
+            <w:tcBorders>
+              <w:top w:val="single" w:sz="4" w:space="0" w:color="E4DED3"/>
+              <w:left w:val="single" w:sz="4" w:space="0" w:color="E4DED3"/>
+              <w:bottom w:val="single" w:sz="4" w:space="0" w:color="E4DED3"/>
+              <w:right w:val="single" w:sz="4" w:space="0" w:color="E4DED3"/>
+            </w:tcBorders>
+          </w:tcPr>
+          <w:p>
+            <w:r>
+              <w:rPr>
+                <w:sz w:val="19"/>
+              </w:rPr>
+              <w:t>2</w:t>
+            </w:r>
+          </w:p>
+        </w:tc>
+        <w:tc>
+          <w:tcPr>
+            <w:tcW w:type="dxa" w:w="3402"/>
+            <w:tcBorders>
+              <w:top w:val="single" w:sz="4" w:space="0" w:color="E4DED3"/>
+              <w:left w:val="single" w:sz="4" w:space="0" w:color="E4DED3"/>
+              <w:bottom w:val="single" w:sz="4" w:space="0" w:color="E4DED3"/>
+              <w:right w:val="single" w:sz="4" w:space="0" w:color="E4DED3"/>
+            </w:tcBorders>
+          </w:tcPr>
+          <w:p>
+            <w:r>
+              <w:rPr>
+                <w:i/>
+                <w:color w:val="6B6660"/>
+                <w:sz w:val="19"/>
+              </w:rPr>
+              <w:t>[ … ]</w:t>
+            </w:r>
+          </w:p>
+        </w:tc>
+        <w:tc>
+          <w:tcPr>
+            <w:tcW w:type="dxa" w:w="2948"/>
+            <w:tcBorders>
+              <w:top w:val="single" w:sz="4" w:space="0" w:color="E4DED3"/>
+              <w:left w:val="single" w:sz="4" w:space="0" w:color="E4DED3"/>
+              <w:bottom w:val="single" w:sz="4" w:space="0" w:color="E4DED3"/>
+              <w:right w:val="single" w:sz="4" w:space="0" w:color="E4DED3"/>
+            </w:tcBorders>
+          </w:tcPr>
+          <w:p>
+            <w:r>
+              <w:rPr>
+                <w:i/>
+                <w:color w:val="6B6660"/>
+                <w:sz w:val="19"/>
+              </w:rPr>
+              <w:t>[ … ]</w:t>
+            </w:r>
+          </w:p>
+        </w:tc>
+        <w:tc>
+          <w:tcPr>
+            <w:tcW w:type="dxa" w:w="2268"/>
+            <w:tcBorders>
+              <w:top w:val="single" w:sz="4" w:space="0" w:color="E4DED3"/>
+              <w:left w:val="single" w:sz="4" w:space="0" w:color="E4DED3"/>
+              <w:bottom w:val="single" w:sz="4" w:space="0" w:color="E4DED3"/>
+              <w:right w:val="single" w:sz="4" w:space="0" w:color="E4DED3"/>
+            </w:tcBorders>
+          </w:tcPr>
+          <w:p>
+            <w:r>
+              <w:rPr>
+                <w:i/>
+                <w:color w:val="6B6660"/>
+                <w:sz w:val="19"/>
+              </w:rPr>
+              <w:t>[ … ]</w:t>
+            </w:r>
+          </w:p>
+        </w:tc>
+      </w:tr>
+      <w:tr>
+        <w:tc>
+          <w:tcPr>
+            <w:tcW w:type="dxa" w:w="454"/>
+            <w:tcBorders>
+              <w:top w:val="single" w:sz="4" w:space="0" w:color="E4DED3"/>
+              <w:left w:val="single" w:sz="4" w:space="0" w:color="E4DED3"/>
+              <w:bottom w:val="single" w:sz="4" w:space="0" w:color="E4DED3"/>
+              <w:right w:val="single" w:sz="4" w:space="0" w:color="E4DED3"/>
+            </w:tcBorders>
+          </w:tcPr>
+          <w:p>
+            <w:r>
+              <w:rPr>
+                <w:sz w:val="19"/>
+              </w:rPr>
+              <w:t>3</w:t>
+            </w:r>
+          </w:p>
+        </w:tc>
+        <w:tc>
+          <w:tcPr>
+            <w:tcW w:type="dxa" w:w="3402"/>
+            <w:tcBorders>
+              <w:top w:val="single" w:sz="4" w:space="0" w:color="E4DED3"/>
+              <w:left w:val="single" w:sz="4" w:space="0" w:color="E4DED3"/>
+              <w:bottom w:val="single" w:sz="4" w:space="0" w:color="E4DED3"/>
+              <w:right w:val="single" w:sz="4" w:space="0" w:color="E4DED3"/>
+            </w:tcBorders>
+          </w:tcPr>
+          <w:p>
+            <w:r>
+              <w:rPr>
+                <w:i/>
+                <w:color w:val="6B6660"/>
+                <w:sz w:val="19"/>
+              </w:rPr>
+              <w:t>[ … ]</w:t>
+            </w:r>
+          </w:p>
+        </w:tc>
+        <w:tc>
+          <w:tcPr>
+            <w:tcW w:type="dxa" w:w="2948"/>
+            <w:tcBorders>
+              <w:top w:val="single" w:sz="4" w:space="0" w:color="E4DED3"/>
+              <w:left w:val="single" w:sz="4" w:space="0" w:color="E4DED3"/>
+              <w:bottom w:val="single" w:sz="4" w:space="0" w:color="E4DED3"/>
+              <w:right w:val="single" w:sz="4" w:space="0" w:color="E4DED3"/>
+            </w:tcBorders>
+          </w:tcPr>
+          <w:p>
+            <w:r>
+              <w:rPr>
+                <w:i/>
+                <w:color w:val="6B6660"/>
+                <w:sz w:val="19"/>
+              </w:rPr>
+              <w:t>[ … ]</w:t>
+            </w:r>
+          </w:p>
+        </w:tc>
+        <w:tc>
+          <w:tcPr>
+            <w:tcW w:type="dxa" w:w="2268"/>
+            <w:tcBorders>
+              <w:top w:val="single" w:sz="4" w:space="0" w:color="E4DED3"/>
+              <w:left w:val="single" w:sz="4" w:space="0" w:color="E4DED3"/>
+              <w:bottom w:val="single" w:sz="4" w:space="0" w:color="E4DED3"/>
+              <w:right w:val="single" w:sz="4" w:space="0" w:color="E4DED3"/>
+            </w:tcBorders>
+          </w:tcPr>
+          <w:p>
+            <w:r>
+              <w:rPr>
+                <w:i/>
+                <w:color w:val="6B6660"/>
+                <w:sz w:val="19"/>
+              </w:rPr>
+              <w:t>[ … ]</w:t>
+            </w:r>
+          </w:p>
+        </w:tc>
+      </w:tr>
+    </w:tbl>
+    <w:p/>
+    <w:p>
+      <w:pPr>
+        <w:pStyle w:val="Heading3"/>
+      </w:pPr>
+      <w:r>
+        <w:t>9.2 Sign-off</w:t>
+      </w:r>
+    </w:p>
+    <w:p>
+      <w:r>
+        <w:rPr>
+          <w:i/>
+          <w:color w:val="6B6660"/>
+          <w:sz w:val="19"/>
+        </w:rPr>
+        <w:t>The accepting authority records their decision. “Approved with comments” means the design proceeds subject to the changes recorded in §9.1.</w:t>
+      </w:r>
+    </w:p>
+    <w:tbl>
+      <w:tblPr>
+        <w:tblW w:type="auto" w:w="0"/>
+        <w:jc w:val="center"/>
+        <w:tblLayout w:type="autofit"/>
+        <w:tblLook w:firstColumn="1" w:firstRow="1" w:lastColumn="0" w:lastRow="0" w:noHBand="0" w:noVBand="1" w:val="04A0"/>
+      </w:tblPr>
+      <w:tblGrid>
+        <w:gridCol w:w="1882"/>
+        <w:gridCol w:w="1882"/>
+        <w:gridCol w:w="1882"/>
+        <w:gridCol w:w="1882"/>
+        <w:gridCol w:w="1882"/>
+      </w:tblGrid>
+      <w:tr>
+        <w:tc>
+          <w:tcPr>
+            <w:tcW w:type="dxa" w:w="2608"/>
+            <w:shd w:val="clear" w:color="auto" w:fill="1F5A5C"/>
+            <w:tcBorders>
+              <w:top w:val="single" w:sz="4" w:space="0" w:color="E4DED3"/>
+              <w:left w:val="single" w:sz="4" w:space="0" w:color="E4DED3"/>
+              <w:bottom w:val="single" w:sz="4" w:space="0" w:color="E4DED3"/>
+              <w:right w:val="single" w:sz="4" w:space="0" w:color="E4DED3"/>
+            </w:tcBorders>
+          </w:tcPr>
+          <w:p>
+            <w:r>
+              <w:rPr>
+                <w:b/>
+                <w:color w:val="FFFFFF"/>
+                <w:sz w:val="19"/>
+              </w:rPr>
+              <w:t>Role</w:t>
+            </w:r>
+          </w:p>
+        </w:tc>
+        <w:tc>
+          <w:tcPr>
+            <w:tcW w:type="dxa" w:w="1814"/>
+            <w:shd w:val="clear" w:color="auto" w:fill="1F5A5C"/>
+            <w:tcBorders>
+              <w:top w:val="single" w:sz="4" w:space="0" w:color="E4DED3"/>
+              <w:left w:val="single" w:sz="4" w:space="0" w:color="E4DED3"/>
+              <w:bottom w:val="single" w:sz="4" w:space="0" w:color="E4DED3"/>
+              <w:right w:val="single" w:sz="4" w:space="0" w:color="E4DED3"/>
+            </w:tcBorders>
+          </w:tcPr>
+          <w:p>
+            <w:r>
+              <w:rPr>
+                <w:b/>
+                <w:color w:val="FFFFFF"/>
+                <w:sz w:val="19"/>
+              </w:rPr>
+              <w:t>Name</w:t>
+            </w:r>
+          </w:p>
+        </w:tc>
+        <w:tc>
+          <w:tcPr>
+            <w:tcW w:type="dxa" w:w="2041"/>
+            <w:shd w:val="clear" w:color="auto" w:fill="1F5A5C"/>
+            <w:tcBorders>
+              <w:top w:val="single" w:sz="4" w:space="0" w:color="E4DED3"/>
+              <w:left w:val="single" w:sz="4" w:space="0" w:color="E4DED3"/>
+              <w:bottom w:val="single" w:sz="4" w:space="0" w:color="E4DED3"/>
+              <w:right w:val="single" w:sz="4" w:space="0" w:color="E4DED3"/>
+            </w:tcBorders>
+          </w:tcPr>
+          <w:p>
+            <w:r>
+              <w:rPr>
+                <w:b/>
+                <w:color w:val="FFFFFF"/>
+                <w:sz w:val="19"/>
+              </w:rPr>
+              <w:t>Decision</w:t>
+            </w:r>
+          </w:p>
+        </w:tc>
+        <w:tc>
+          <w:tcPr>
+            <w:tcW w:type="dxa" w:w="1361"/>
+            <w:shd w:val="clear" w:color="auto" w:fill="1F5A5C"/>
+            <w:tcBorders>
+              <w:top w:val="single" w:sz="4" w:space="0" w:color="E4DED3"/>
+              <w:left w:val="single" w:sz="4" w:space="0" w:color="E4DED3"/>
+              <w:bottom w:val="single" w:sz="4" w:space="0" w:color="E4DED3"/>
+              <w:right w:val="single" w:sz="4" w:space="0" w:color="E4DED3"/>
+            </w:tcBorders>
+          </w:tcPr>
+          <w:p>
+            <w:r>
+              <w:rPr>
+                <w:b/>
+                <w:color w:val="FFFFFF"/>
+                <w:sz w:val="19"/>
+              </w:rPr>
+              <w:t>Date</w:t>
+            </w:r>
+          </w:p>
+        </w:tc>
+        <w:tc>
+          <w:tcPr>
+            <w:tcW w:type="dxa" w:w="1247"/>
+            <w:shd w:val="clear" w:color="auto" w:fill="1F5A5C"/>
+            <w:tcBorders>
+              <w:top w:val="single" w:sz="4" w:space="0" w:color="E4DED3"/>
+              <w:left w:val="single" w:sz="4" w:space="0" w:color="E4DED3"/>
+              <w:bottom w:val="single" w:sz="4" w:space="0" w:color="E4DED3"/>
+              <w:right w:val="single" w:sz="4" w:space="0" w:color="E4DED3"/>
+            </w:tcBorders>
+          </w:tcPr>
+          <w:p>
+            <w:r>
+              <w:rPr>
+                <w:b/>
+                <w:color w:val="FFFFFF"/>
+                <w:sz w:val="19"/>
+              </w:rPr>
+              <w:t>Signature</w:t>
+            </w:r>
+          </w:p>
+        </w:tc>
+      </w:tr>
+      <w:tr>
+        <w:tc>
+          <w:tcPr>
+            <w:tcW w:type="dxa" w:w="2608"/>
+            <w:tcBorders>
+              <w:top w:val="single" w:sz="4" w:space="0" w:color="E4DED3"/>
+              <w:left w:val="single" w:sz="4" w:space="0" w:color="E4DED3"/>
+              <w:bottom w:val="single" w:sz="4" w:space="0" w:color="E4DED3"/>
+              <w:right w:val="single" w:sz="4" w:space="0" w:color="E4DED3"/>
+            </w:tcBorders>
+          </w:tcPr>
+          <w:p>
+            <w:r>
+              <w:rPr>
+                <w:sz w:val="19"/>
+              </w:rPr>
+              <w:t>Prepared by (author)</w:t>
+            </w:r>
+          </w:p>
+        </w:tc>
+        <w:tc>
+          <w:tcPr>
+            <w:tcW w:type="dxa" w:w="1814"/>
+            <w:tcBorders>
+              <w:top w:val="single" w:sz="4" w:space="0" w:color="E4DED3"/>
+              <w:left w:val="single" w:sz="4" w:space="0" w:color="E4DED3"/>
+              <w:bottom w:val="single" w:sz="4" w:space="0" w:color="E4DED3"/>
+              <w:right w:val="single" w:sz="4" w:space="0" w:color="E4DED3"/>
+            </w:tcBorders>
+          </w:tcPr>
+          <w:p>
+            <w:r>
+              <w:rPr>
+                <w:i/>
+                <w:color w:val="6B6660"/>
+                <w:sz w:val="19"/>
+              </w:rPr>
+              <w:t>[ name, role ]</w:t>
+            </w:r>
+          </w:p>
+        </w:tc>
+        <w:tc>
+          <w:tcPr>
+            <w:tcW w:type="dxa" w:w="2041"/>
+            <w:tcBorders>
+              <w:top w:val="single" w:sz="4" w:space="0" w:color="E4DED3"/>
+              <w:left w:val="single" w:sz="4" w:space="0" w:color="E4DED3"/>
+              <w:bottom w:val="single" w:sz="4" w:space="0" w:color="E4DED3"/>
+              <w:right w:val="single" w:sz="4" w:space="0" w:color="E4DED3"/>
+            </w:tcBorders>
+          </w:tcPr>
+          <w:p>
+            <w:r>
+              <w:rPr>
+                <w:sz w:val="19"/>
+              </w:rPr>
+              <w:t>—</w:t>
+            </w:r>
+          </w:p>
+        </w:tc>
+        <w:tc>
+          <w:tcPr>
+            <w:tcW w:type="dxa" w:w="1361"/>
+            <w:tcBorders>
+              <w:top w:val="single" w:sz="4" w:space="0" w:color="E4DED3"/>
+              <w:left w:val="single" w:sz="4" w:space="0" w:color="E4DED3"/>
+              <w:bottom w:val="single" w:sz="4" w:space="0" w:color="E4DED3"/>
+              <w:right w:val="single" w:sz="4" w:space="0" w:color="E4DED3"/>
+            </w:tcBorders>
+          </w:tcPr>
+          <w:p>
+            <w:r>
+              <w:rPr>
+                <w:i/>
+                <w:color w:val="6B6660"/>
+                <w:sz w:val="19"/>
+              </w:rPr>
+              <w:t>[ DD/MM/YYYY ]</w:t>
+            </w:r>
+          </w:p>
+        </w:tc>
+        <w:tc>
+          <w:tcPr>
+            <w:tcW w:type="dxa" w:w="1247"/>
+            <w:tcBorders>
+              <w:top w:val="single" w:sz="4" w:space="0" w:color="E4DED3"/>
+              <w:left w:val="single" w:sz="4" w:space="0" w:color="E4DED3"/>
+              <w:bottom w:val="single" w:sz="4" w:space="0" w:color="E4DED3"/>
+              <w:right w:val="single" w:sz="4" w:space="0" w:color="E4DED3"/>
+            </w:tcBorders>
+          </w:tcPr>
+          <w:p>
+            <w:r>
+              <w:rPr>
+                <w:sz w:val="19"/>
+              </w:rPr>
+            </w:r>
+          </w:p>
+        </w:tc>
+      </w:tr>
+      <w:tr>
+        <w:tc>
+          <w:tcPr>
+            <w:tcW w:type="dxa" w:w="2608"/>
+            <w:tcBorders>
+              <w:top w:val="single" w:sz="4" w:space="0" w:color="E4DED3"/>
+              <w:left w:val="single" w:sz="4" w:space="0" w:color="E4DED3"/>
+              <w:bottom w:val="single" w:sz="4" w:space="0" w:color="E4DED3"/>
+              <w:right w:val="single" w:sz="4" w:space="0" w:color="E4DED3"/>
+            </w:tcBorders>
+          </w:tcPr>
+          <w:p>
+            <w:r>
+              <w:rPr>
+                <w:sz w:val="19"/>
+              </w:rPr>
+              <w:t>Reviewed and approved by (accepting authority)</w:t>
+            </w:r>
+          </w:p>
+        </w:tc>
+        <w:tc>
+          <w:tcPr>
+            <w:tcW w:type="dxa" w:w="1814"/>
+            <w:tcBorders>
+              <w:top w:val="single" w:sz="4" w:space="0" w:color="E4DED3"/>
+              <w:left w:val="single" w:sz="4" w:space="0" w:color="E4DED3"/>
+              <w:bottom w:val="single" w:sz="4" w:space="0" w:color="E4DED3"/>
+              <w:right w:val="single" w:sz="4" w:space="0" w:color="E4DED3"/>
+            </w:tcBorders>
+          </w:tcPr>
+          <w:p>
+            <w:r>
+              <w:rPr>
+                <w:i/>
+                <w:color w:val="6B6660"/>
+                <w:sz w:val="19"/>
+              </w:rPr>
+              <w:t>[ name, role ]</w:t>
+            </w:r>
+          </w:p>
+        </w:tc>
+        <w:tc>
+          <w:tcPr>
+            <w:tcW w:type="dxa" w:w="2041"/>
+            <w:tcBorders>
+              <w:top w:val="single" w:sz="4" w:space="0" w:color="E4DED3"/>
+              <w:left w:val="single" w:sz="4" w:space="0" w:color="E4DED3"/>
+              <w:bottom w:val="single" w:sz="4" w:space="0" w:color="E4DED3"/>
+              <w:right w:val="single" w:sz="4" w:space="0" w:color="E4DED3"/>
+            </w:tcBorders>
+          </w:tcPr>
+          <w:p>
+            <w:r>
+              <w:rPr>
+                <w:i/>
+                <w:color w:val="6B6660"/>
+                <w:sz w:val="19"/>
+              </w:rPr>
+              <w:t>[ Approved / Approved with comments / Rejected ]</w:t>
+            </w:r>
+          </w:p>
+        </w:tc>
+        <w:tc>
+          <w:tcPr>
+            <w:tcW w:type="dxa" w:w="1361"/>
+            <w:tcBorders>
+              <w:top w:val="single" w:sz="4" w:space="0" w:color="E4DED3"/>
+              <w:left w:val="single" w:sz="4" w:space="0" w:color="E4DED3"/>
+              <w:bottom w:val="single" w:sz="4" w:space="0" w:color="E4DED3"/>
+              <w:right w:val="single" w:sz="4" w:space="0" w:color="E4DED3"/>
+            </w:tcBorders>
+          </w:tcPr>
+          <w:p>
+            <w:r>
+              <w:rPr>
+                <w:i/>
+                <w:color w:val="6B6660"/>
+                <w:sz w:val="19"/>
+              </w:rPr>
+              <w:t>[ DD/MM/YYYY ]</w:t>
+            </w:r>
+          </w:p>
+        </w:tc>
+        <w:tc>
+          <w:tcPr>
+            <w:tcW w:type="dxa" w:w="1247"/>
+            <w:tcBorders>
+              <w:top w:val="single" w:sz="4" w:space="0" w:color="E4DED3"/>
+              <w:left w:val="single" w:sz="4" w:space="0" w:color="E4DED3"/>
+              <w:bottom w:val="single" w:sz="4" w:space="0" w:color="E4DED3"/>
+              <w:right w:val="single" w:sz="4" w:space="0" w:color="E4DED3"/>
+            </w:tcBorders>
+          </w:tcPr>
+          <w:p>
+            <w:r>
+              <w:rPr>
+                <w:sz w:val="19"/>
+              </w:rPr>
+            </w:r>
+          </w:p>
+        </w:tc>
+      </w:tr>
+    </w:tbl>
+    <w:p/>
+    <w:p>
+      <w:pPr>
+        <w:pStyle w:val="Heading1"/>
+      </w:pPr>
+      <w:r>
         <w:t>Document control</w:t>
       </w:r>
     </w:p>

</xml_diff>